<commit_message>
Documento: el mail de recuperacion es opcional
</commit_message>
<xml_diff>
--- a/EyeLecture-accounts-and-access.docx
+++ b/EyeLecture-accounts-and-access.docx
@@ -712,7 +712,7 @@
           <w:sz w:val="21"/>
           <w:szCs w:val="21"/>
         </w:rPr>
-        <w:t xml:space="preserve">First a name, a username and a password — nothing else. The account exists from that point, but the only screen it can reach is the second step, which asks for the rank and the two addresses. Nothing is decided until then, because nothing can be.</w:t>
+        <w:t xml:space="preserve">First a name, a username and a password — nothing else. The account exists from that point, but the only screen it can reach is the second step, which asks for the rank and the institutional address. Nothing is decided until then, because nothing can be.</w:t>
       </w:r>
     </w:p>
     <w:p>
@@ -1381,7 +1381,26 @@
           <w:sz w:val="21"/>
           <w:szCs w:val="21"/>
         </w:rPr>
-        <w:t xml:space="preserve">Every account carries a second, personal address alongside the institutional one. The reason is what happens after graduation: the university closes the institutional mailbox, and without another address the account becomes unreachable.</w:t>
+        <w:t xml:space="preserve">Alongside the institutional address, an account can carry a second, personal one. The reason is what happens after graduation: the university closes the institutional mailbox, and without another address the account becomes unreachable.</w:t>
+      </w:r>
+    </w:p>
+    <w:p>
+      <w:pPr>
+        <w:pStyle w:val="ListParagraph"/>
+        <w:numPr>
+          <w:ilvl w:val="0"/>
+          <w:numId w:val="1"/>
+        </w:numPr>
+        <w:spacing w:after="90" w:line="276"/>
+      </w:pPr>
+      <w:r>
+        <w:rPr>
+          <w:rFonts w:ascii="Calibri" w:cs="Calibri" w:eastAsia="Calibri" w:hAnsi="Calibri"/>
+          <w:color w:val="0F172A"/>
+          <w:sz w:val="21"/>
+          <w:szCs w:val="21"/>
+        </w:rPr>
+        <w:t xml:space="preserve">It is optional. Signing up does not wait on it, and it can be added from the profile at any time.</w:t>
       </w:r>
     </w:p>
     <w:p>

</xml_diff>

<commit_message>
Documento: perfil clinico del attending
</commit_message>
<xml_diff>
--- a/EyeLecture-accounts-and-access.docx
+++ b/EyeLecture-accounts-and-access.docx
@@ -713,6 +713,20 @@
           <w:szCs w:val="21"/>
         </w:rPr>
         <w:t xml:space="preserve">First a name, a username and a password — nothing else. The account exists from that point, but the only screen it can reach is the second step, which asks for the rank and the institutional address. Nothing is decided until then, because nothing can be.</w:t>
+      </w:r>
+    </w:p>
+    <w:p>
+      <w:pPr>
+        <w:spacing w:after="140" w:line="276"/>
+      </w:pPr>
+      <w:r>
+        <w:rPr>
+          <w:rFonts w:ascii="Calibri" w:cs="Calibri" w:eastAsia="Calibri" w:hAnsi="Calibri"/>
+          <w:color w:val="0F172A"/>
+          <w:sz w:val="21"/>
+          <w:szCs w:val="21"/>
+        </w:rPr>
+        <w:t xml:space="preserve">An attending physician is asked one more thing there: their clinical focus, and where they trained. Nobody else sees those fields.</w:t>
       </w:r>
     </w:p>
     <w:p>
@@ -1567,7 +1581,95 @@
           <w:sz w:val="30"/>
           <w:szCs w:val="30"/>
         </w:rPr>
-        <w:t xml:space="preserve">6. Not built yet</w:t>
+        <w:t xml:space="preserve">6. What an attending physician records</w:t>
+      </w:r>
+    </w:p>
+    <w:p>
+      <w:pPr>
+        <w:spacing w:after="140" w:line="276"/>
+      </w:pPr>
+      <w:r>
+        <w:rPr>
+          <w:rFonts w:ascii="Calibri" w:cs="Calibri" w:eastAsia="Calibri" w:hAnsi="Calibri"/>
+          <w:color w:val="0F172A"/>
+          <w:sz w:val="21"/>
+          <w:szCs w:val="21"/>
+        </w:rPr>
+        <w:t xml:space="preserve">Picking that rank adds a short block to the second step: a clinical focus, a residency programme and a fellowship programme, each chosen from a list an administrator keeps.</w:t>
+      </w:r>
+    </w:p>
+    <w:p>
+      <w:pPr>
+        <w:pStyle w:val="ListParagraph"/>
+        <w:numPr>
+          <w:ilvl w:val="0"/>
+          <w:numId w:val="1"/>
+        </w:numPr>
+        <w:spacing w:after="90" w:line="276"/>
+      </w:pPr>
+      <w:r>
+        <w:rPr>
+          <w:rFonts w:ascii="Calibri" w:cs="Calibri" w:eastAsia="Calibri" w:hAnsi="Calibri"/>
+          <w:color w:val="0F172A"/>
+          <w:sz w:val="21"/>
+          <w:szCs w:val="21"/>
+        </w:rPr>
+        <w:t xml:space="preserve">The clinical focus is required. It is the answer that makes the account useful.</w:t>
+      </w:r>
+    </w:p>
+    <w:p>
+      <w:pPr>
+        <w:pStyle w:val="ListParagraph"/>
+        <w:numPr>
+          <w:ilvl w:val="0"/>
+          <w:numId w:val="1"/>
+        </w:numPr>
+        <w:spacing w:after="90" w:line="276"/>
+      </w:pPr>
+      <w:r>
+        <w:rPr>
+          <w:rFonts w:ascii="Calibri" w:cs="Calibri" w:eastAsia="Calibri" w:hAnsi="Calibri"/>
+          <w:color w:val="0F172A"/>
+          <w:sz w:val="21"/>
+          <w:szCs w:val="21"/>
+        </w:rPr>
+        <w:t xml:space="preserve">Residency and fellowship are optional, and both offer a "not listed" choice. The lists are still short, and nobody should be unable to finish signing up because their programme has not been added yet.</w:t>
+      </w:r>
+    </w:p>
+    <w:p>
+      <w:pPr>
+        <w:pStyle w:val="ListParagraph"/>
+        <w:numPr>
+          <w:ilvl w:val="0"/>
+          <w:numId w:val="1"/>
+        </w:numPr>
+        <w:spacing w:after="90" w:line="276"/>
+      </w:pPr>
+      <w:r>
+        <w:rPr>
+          <w:rFonts w:ascii="Calibri" w:cs="Calibri" w:eastAsia="Calibri" w:hAnsi="Calibri"/>
+          <w:color w:val="0F172A"/>
+          <w:sz w:val="21"/>
+          <w:szCs w:val="21"/>
+        </w:rPr>
+        <w:t xml:space="preserve">Nobody else records these. Whether a resident should name the programme they are currently in is still an open question.</w:t>
+      </w:r>
+    </w:p>
+    <w:p>
+      <w:pPr>
+        <w:pStyle w:val="Heading1"/>
+        <w:spacing w:after="160" w:before="320"/>
+      </w:pPr>
+      <w:r>
+        <w:rPr>
+          <w:rFonts w:ascii="Calibri" w:cs="Calibri" w:eastAsia="Calibri" w:hAnsi="Calibri"/>
+          <w:b/>
+          <w:bCs/>
+          <w:color w:val="0F172A"/>
+          <w:sz w:val="30"/>
+          <w:szCs w:val="30"/>
+        </w:rPr>
+        <w:t xml:space="preserve">7. Not built yet</w:t>
       </w:r>
     </w:p>
     <w:p>
@@ -1865,7 +1967,7 @@
                 <w:sz w:val="19"/>
                 <w:szCs w:val="19"/>
               </w:rPr>
-              <w:t xml:space="preserve">Specialty and training on the profile</w:t>
+              <w:t xml:space="preserve">ASCRS membership</w:t>
             </w:r>
           </w:p>
         </w:tc>
@@ -1892,7 +1994,7 @@
                 <w:sz w:val="19"/>
                 <w:szCs w:val="19"/>
               </w:rPr>
-              <w:t xml:space="preserve">Attending physicians will pick a specialty, residency and fellowship. The lists exist and are editable; the step that asks for them does not yet.</w:t>
+              <w:t xml:space="preserve">The signup flow has a place for it in the design. Whether it can be verified, and how, is still being worked out with ASCRS.</w:t>
             </w:r>
           </w:p>
         </w:tc>

</xml_diff>